<commit_message>
Fix bug: Analytics tab was missing 3 of 4 chart loads (monthly trend, hotspots, property recovery); refresh demo screenshots and docs
</commit_message>
<xml_diff>
--- a/docs/KRIME_AI_Demo_Guide.docx
+++ b/docs/KRIME_AI_Demo_Guide.docx
@@ -982,7 +982,7 @@
       <w:r>
         <w:drawing>
           <wp:inline xmlns:a="http://schemas.openxmlformats.org/drawingml/2006/main" xmlns:pic="http://schemas.openxmlformats.org/drawingml/2006/picture">
-            <wp:extent cx="5486400" cy="4294748"/>
+            <wp:extent cx="5486400" cy="2857500"/>
             <wp:docPr id="5" name="Picture 5"/>
             <wp:cNvGraphicFramePr>
               <a:graphicFrameLocks noChangeAspect="1"/>
@@ -1003,7 +1003,7 @@
                   <pic:spPr>
                     <a:xfrm>
                       <a:off x="0" y="0"/>
-                      <a:ext cx="5486400" cy="4294748"/>
+                      <a:ext cx="5486400" cy="2857500"/>
                     </a:xfrm>
                     <a:prstGeom prst="rect"/>
                   </pic:spPr>
@@ -1060,7 +1060,7 @@
       <w:r>
         <w:drawing>
           <wp:inline xmlns:a="http://schemas.openxmlformats.org/drawingml/2006/main" xmlns:pic="http://schemas.openxmlformats.org/drawingml/2006/picture">
-            <wp:extent cx="5486400" cy="4294748"/>
+            <wp:extent cx="5486400" cy="2449286"/>
             <wp:docPr id="6" name="Picture 6"/>
             <wp:cNvGraphicFramePr>
               <a:graphicFrameLocks noChangeAspect="1"/>
@@ -1081,7 +1081,7 @@
                   <pic:spPr>
                     <a:xfrm>
                       <a:off x="0" y="0"/>
-                      <a:ext cx="5486400" cy="4294748"/>
+                      <a:ext cx="5486400" cy="2449286"/>
                     </a:xfrm>
                     <a:prstGeom prst="rect"/>
                   </pic:spPr>
@@ -1102,7 +1102,7 @@
           <w:color w:val="555555"/>
           <w:sz w:val="18"/>
         </w:rPr>
-        <w:t>Anomaly detection results flagging 2 stations</w:t>
+        <w:t>Anomaly detection results flagging an anomalous station</w:t>
       </w:r>
     </w:p>
     <w:p>
@@ -1128,7 +1128,7 @@
         <w:pStyle w:val="ListBullet"/>
       </w:pPr>
       <w:r>
-        <w:t>Flagged stations (e.g. Bajpe, Ullal in Mangaluru) show case count, average severity, pending count, and high-severity count — actionable for administrative review.</w:t>
+        <w:t>Flagged stations (results vary per scan since severity is randomized in the synthetic dataset) show case count, average severity, pending count, and high-severity count — actionable for administrative review.</w:t>
       </w:r>
     </w:p>
     <w:p>

</xml_diff>

<commit_message>
Remove timing estimates from Demo Guide flow table
</commit_message>
<xml_diff>
--- a/docs/KRIME_AI_Demo_Guide.docx
+++ b/docs/KRIME_AI_Demo_Guide.docx
@@ -121,7 +121,7 @@
         <w:rPr>
           <w:color w:val="0D1B2A"/>
         </w:rPr>
-        <w:t>⏱ Suggested Demo Flow (8–10 minutes)</w:t>
+        <w:t>⏱ Suggested Demo Flow</w:t>
       </w:r>
     </w:p>
     <w:tbl>
@@ -132,14 +132,13 @@
         <w:tblLook w:firstColumn="1" w:firstRow="1" w:lastColumn="0" w:lastRow="0" w:noHBand="0" w:noVBand="1" w:val="04A0"/>
       </w:tblPr>
       <w:tblGrid>
-        <w:gridCol w:w="2880"/>
-        <w:gridCol w:w="2880"/>
-        <w:gridCol w:w="2880"/>
+        <w:gridCol w:w="4320"/>
+        <w:gridCol w:w="4320"/>
       </w:tblGrid>
       <w:tr>
         <w:tc>
           <w:tcPr>
-            <w:tcW w:type="dxa" w:w="2880"/>
+            <w:tcW w:type="dxa" w:w="4320"/>
             <w:shd w:fill="1A73E8"/>
           </w:tcPr>
           <w:p>
@@ -155,7 +154,7 @@
         </w:tc>
         <w:tc>
           <w:tcPr>
-            <w:tcW w:type="dxa" w:w="2880"/>
+            <w:tcW w:type="dxa" w:w="4320"/>
             <w:shd w:fill="1A73E8"/>
           </w:tcPr>
           <w:p>
@@ -169,27 +168,11 @@
             </w:r>
           </w:p>
         </w:tc>
-        <w:tc>
-          <w:tcPr>
-            <w:tcW w:type="dxa" w:w="2880"/>
-            <w:shd w:fill="1A73E8"/>
-          </w:tcPr>
-          <w:p>
-            <w:r/>
-            <w:r>
-              <w:rPr>
-                <w:b/>
-                <w:color w:val="FFFFFF"/>
-              </w:rPr>
-              <w:t>Time</w:t>
-            </w:r>
-          </w:p>
-        </w:tc>
       </w:tr>
       <w:tr>
         <w:tc>
           <w:tcPr>
-            <w:tcW w:type="dxa" w:w="2880"/>
+            <w:tcW w:type="dxa" w:w="4320"/>
           </w:tcPr>
           <w:p>
             <w:r>
@@ -199,7 +182,7 @@
         </w:tc>
         <w:tc>
           <w:tcPr>
-            <w:tcW w:type="dxa" w:w="2880"/>
+            <w:tcW w:type="dxa" w:w="4320"/>
           </w:tcPr>
           <w:p>
             <w:r>
@@ -207,21 +190,11 @@
             </w:r>
           </w:p>
         </w:tc>
-        <w:tc>
-          <w:tcPr>
-            <w:tcW w:type="dxa" w:w="2880"/>
-          </w:tcPr>
-          <w:p>
-            <w:r>
-              <w:t>1 min</w:t>
-            </w:r>
-          </w:p>
-        </w:tc>
       </w:tr>
       <w:tr>
         <w:tc>
           <w:tcPr>
-            <w:tcW w:type="dxa" w:w="2880"/>
+            <w:tcW w:type="dxa" w:w="4320"/>
           </w:tcPr>
           <w:p>
             <w:r>
@@ -231,7 +204,7 @@
         </w:tc>
         <w:tc>
           <w:tcPr>
-            <w:tcW w:type="dxa" w:w="2880"/>
+            <w:tcW w:type="dxa" w:w="4320"/>
           </w:tcPr>
           <w:p>
             <w:r>
@@ -239,21 +212,11 @@
             </w:r>
           </w:p>
         </w:tc>
-        <w:tc>
-          <w:tcPr>
-            <w:tcW w:type="dxa" w:w="2880"/>
-          </w:tcPr>
-          <w:p>
-            <w:r>
-              <w:t>2 min</w:t>
-            </w:r>
-          </w:p>
-        </w:tc>
       </w:tr>
       <w:tr>
         <w:tc>
           <w:tcPr>
-            <w:tcW w:type="dxa" w:w="2880"/>
+            <w:tcW w:type="dxa" w:w="4320"/>
           </w:tcPr>
           <w:p>
             <w:r>
@@ -263,7 +226,7 @@
         </w:tc>
         <w:tc>
           <w:tcPr>
-            <w:tcW w:type="dxa" w:w="2880"/>
+            <w:tcW w:type="dxa" w:w="4320"/>
           </w:tcPr>
           <w:p>
             <w:r>
@@ -271,21 +234,11 @@
             </w:r>
           </w:p>
         </w:tc>
-        <w:tc>
-          <w:tcPr>
-            <w:tcW w:type="dxa" w:w="2880"/>
-          </w:tcPr>
-          <w:p>
-            <w:r>
-              <w:t>1 min</w:t>
-            </w:r>
-          </w:p>
-        </w:tc>
       </w:tr>
       <w:tr>
         <w:tc>
           <w:tcPr>
-            <w:tcW w:type="dxa" w:w="2880"/>
+            <w:tcW w:type="dxa" w:w="4320"/>
           </w:tcPr>
           <w:p>
             <w:r>
@@ -295,7 +248,7 @@
         </w:tc>
         <w:tc>
           <w:tcPr>
-            <w:tcW w:type="dxa" w:w="2880"/>
+            <w:tcW w:type="dxa" w:w="4320"/>
           </w:tcPr>
           <w:p>
             <w:r>
@@ -303,21 +256,11 @@
             </w:r>
           </w:p>
         </w:tc>
-        <w:tc>
-          <w:tcPr>
-            <w:tcW w:type="dxa" w:w="2880"/>
-          </w:tcPr>
-          <w:p>
-            <w:r>
-              <w:t>1.5 min</w:t>
-            </w:r>
-          </w:p>
-        </w:tc>
       </w:tr>
       <w:tr>
         <w:tc>
           <w:tcPr>
-            <w:tcW w:type="dxa" w:w="2880"/>
+            <w:tcW w:type="dxa" w:w="4320"/>
           </w:tcPr>
           <w:p>
             <w:r>
@@ -327,7 +270,7 @@
         </w:tc>
         <w:tc>
           <w:tcPr>
-            <w:tcW w:type="dxa" w:w="2880"/>
+            <w:tcW w:type="dxa" w:w="4320"/>
           </w:tcPr>
           <w:p>
             <w:r>
@@ -335,21 +278,11 @@
             </w:r>
           </w:p>
         </w:tc>
-        <w:tc>
-          <w:tcPr>
-            <w:tcW w:type="dxa" w:w="2880"/>
-          </w:tcPr>
-          <w:p>
-            <w:r>
-              <w:t>0.5 min</w:t>
-            </w:r>
-          </w:p>
-        </w:tc>
       </w:tr>
       <w:tr>
         <w:tc>
           <w:tcPr>
-            <w:tcW w:type="dxa" w:w="2880"/>
+            <w:tcW w:type="dxa" w:w="4320"/>
           </w:tcPr>
           <w:p>
             <w:r>
@@ -359,7 +292,7 @@
         </w:tc>
         <w:tc>
           <w:tcPr>
-            <w:tcW w:type="dxa" w:w="2880"/>
+            <w:tcW w:type="dxa" w:w="4320"/>
           </w:tcPr>
           <w:p>
             <w:r>
@@ -367,21 +300,11 @@
             </w:r>
           </w:p>
         </w:tc>
-        <w:tc>
-          <w:tcPr>
-            <w:tcW w:type="dxa" w:w="2880"/>
-          </w:tcPr>
-          <w:p>
-            <w:r>
-              <w:t>1 min</w:t>
-            </w:r>
-          </w:p>
-        </w:tc>
       </w:tr>
       <w:tr>
         <w:tc>
           <w:tcPr>
-            <w:tcW w:type="dxa" w:w="2880"/>
+            <w:tcW w:type="dxa" w:w="4320"/>
           </w:tcPr>
           <w:p>
             <w:r>
@@ -391,7 +314,7 @@
         </w:tc>
         <w:tc>
           <w:tcPr>
-            <w:tcW w:type="dxa" w:w="2880"/>
+            <w:tcW w:type="dxa" w:w="4320"/>
           </w:tcPr>
           <w:p>
             <w:r>
@@ -399,21 +322,11 @@
             </w:r>
           </w:p>
         </w:tc>
-        <w:tc>
-          <w:tcPr>
-            <w:tcW w:type="dxa" w:w="2880"/>
-          </w:tcPr>
-          <w:p>
-            <w:r>
-              <w:t>1 min</w:t>
-            </w:r>
-          </w:p>
-        </w:tc>
       </w:tr>
       <w:tr>
         <w:tc>
           <w:tcPr>
-            <w:tcW w:type="dxa" w:w="2880"/>
+            <w:tcW w:type="dxa" w:w="4320"/>
           </w:tcPr>
           <w:p>
             <w:r>
@@ -423,7 +336,7 @@
         </w:tc>
         <w:tc>
           <w:tcPr>
-            <w:tcW w:type="dxa" w:w="2880"/>
+            <w:tcW w:type="dxa" w:w="4320"/>
           </w:tcPr>
           <w:p>
             <w:r>
@@ -431,21 +344,11 @@
             </w:r>
           </w:p>
         </w:tc>
-        <w:tc>
-          <w:tcPr>
-            <w:tcW w:type="dxa" w:w="2880"/>
-          </w:tcPr>
-          <w:p>
-            <w:r>
-              <w:t>0.5 min</w:t>
-            </w:r>
-          </w:p>
-        </w:tc>
       </w:tr>
       <w:tr>
         <w:tc>
           <w:tcPr>
-            <w:tcW w:type="dxa" w:w="2880"/>
+            <w:tcW w:type="dxa" w:w="4320"/>
           </w:tcPr>
           <w:p>
             <w:r>
@@ -455,21 +358,11 @@
         </w:tc>
         <w:tc>
           <w:tcPr>
-            <w:tcW w:type="dxa" w:w="2880"/>
+            <w:tcW w:type="dxa" w:w="4320"/>
           </w:tcPr>
           <w:p>
             <w:r>
               <w:t>Voice Interaction + Role Restriction Demo</w:t>
-            </w:r>
-          </w:p>
-        </w:tc>
-        <w:tc>
-          <w:tcPr>
-            <w:tcW w:type="dxa" w:w="2880"/>
-          </w:tcPr>
-          <w:p>
-            <w:r>
-              <w:t>1 min</w:t>
             </w:r>
           </w:p>
         </w:tc>

</xml_diff>